<commit_message>
docs(code-artifacts): update the Spanish code artifacts with the October 21 evening changes
</commit_message>
<xml_diff>
--- a/05_ARTEFACTOS_DE_CODIGO/ES/WORD/05_Artefactos_De_Codigo.docx
+++ b/05_ARTEFACTOS_DE_CODIGO/ES/WORD/05_Artefactos_De_Codigo.docx
@@ -268,7 +268,7 @@
               <w:pStyle w:val="Compact"/>
             </w:pPr>
             <w:r>
-              <w:t xml:space="preserve">20 de octubre de 2026</w:t>
+              <w:t xml:space="preserve">21 de octubre de 2026</w:t>
             </w:r>
           </w:p>
         </w:tc>
@@ -386,7 +386,7 @@
           <w:i/>
           <w:iCs/>
         </w:rPr>
-        <w:t xml:space="preserve">, corte 20 de octubre de 2026)</w:t>
+        <w:t xml:space="preserve">, corte 21 de octubre de 2026)</w:t>
       </w:r>
     </w:p>
     <w:tbl>
@@ -508,18 +508,18 @@
               <w:pStyle w:val="Compact"/>
             </w:pPr>
             <w:r>
-              <w:t xml:space="preserve">449</w:t>
-            </w:r>
-          </w:p>
-        </w:tc>
-        <w:tc>
-          <w:tcPr/>
-          <w:p>
-            <w:pPr>
-              <w:pStyle w:val="Compact"/>
-            </w:pPr>
-            <w:r>
-              <w:t xml:space="preserve">2026-10-20</w:t>
+              <w:t xml:space="preserve">474</w:t>
+            </w:r>
+          </w:p>
+        </w:tc>
+        <w:tc>
+          <w:tcPr/>
+          <w:p>
+            <w:pPr>
+              <w:pStyle w:val="Compact"/>
+            </w:pPr>
+            <w:r>
+              <w:t xml:space="preserve">2026-10-21</w:t>
             </w:r>
           </w:p>
         </w:tc>
@@ -570,18 +570,18 @@
               <w:pStyle w:val="Compact"/>
             </w:pPr>
             <w:r>
-              <w:t xml:space="preserve">221</w:t>
-            </w:r>
-          </w:p>
-        </w:tc>
-        <w:tc>
-          <w:tcPr/>
-          <w:p>
-            <w:pPr>
-              <w:pStyle w:val="Compact"/>
-            </w:pPr>
-            <w:r>
-              <w:t xml:space="preserve">2026-10-20</w:t>
+              <w:t xml:space="preserve">236</w:t>
+            </w:r>
+          </w:p>
+        </w:tc>
+        <w:tc>
+          <w:tcPr/>
+          <w:p>
+            <w:pPr>
+              <w:pStyle w:val="Compact"/>
+            </w:pPr>
+            <w:r>
+              <w:t xml:space="preserve">2026-10-21</w:t>
             </w:r>
           </w:p>
         </w:tc>
@@ -632,18 +632,18 @@
               <w:pStyle w:val="Compact"/>
             </w:pPr>
             <w:r>
-              <w:t xml:space="preserve">68</w:t>
-            </w:r>
-          </w:p>
-        </w:tc>
-        <w:tc>
-          <w:tcPr/>
-          <w:p>
-            <w:pPr>
-              <w:pStyle w:val="Compact"/>
-            </w:pPr>
-            <w:r>
-              <w:t xml:space="preserve">2026-10-19</w:t>
+              <w:t xml:space="preserve">86</w:t>
+            </w:r>
+          </w:p>
+        </w:tc>
+        <w:tc>
+          <w:tcPr/>
+          <w:p>
+            <w:pPr>
+              <w:pStyle w:val="Compact"/>
+            </w:pPr>
+            <w:r>
+              <w:t xml:space="preserve">2026-10-21</w:t>
             </w:r>
           </w:p>
         </w:tc>
@@ -694,18 +694,18 @@
               <w:pStyle w:val="Compact"/>
             </w:pPr>
             <w:r>
-              <w:t xml:space="preserve">16</w:t>
-            </w:r>
-          </w:p>
-        </w:tc>
-        <w:tc>
-          <w:tcPr/>
-          <w:p>
-            <w:pPr>
-              <w:pStyle w:val="Compact"/>
-            </w:pPr>
-            <w:r>
-              <w:t xml:space="preserve">2026-10-19</w:t>
+              <w:t xml:space="preserve">21</w:t>
+            </w:r>
+          </w:p>
+        </w:tc>
+        <w:tc>
+          <w:tcPr/>
+          <w:p>
+            <w:pPr>
+              <w:pStyle w:val="Compact"/>
+            </w:pPr>
+            <w:r>
+              <w:t xml:space="preserve">2026-10-21</w:t>
             </w:r>
           </w:p>
         </w:tc>
@@ -756,18 +756,18 @@
               <w:pStyle w:val="Compact"/>
             </w:pPr>
             <w:r>
-              <w:t xml:space="preserve">60</w:t>
-            </w:r>
-          </w:p>
-        </w:tc>
-        <w:tc>
-          <w:tcPr/>
-          <w:p>
-            <w:pPr>
-              <w:pStyle w:val="Compact"/>
-            </w:pPr>
-            <w:r>
-              <w:t xml:space="preserve">2026-10-20</w:t>
+              <w:t xml:space="preserve">63</w:t>
+            </w:r>
+          </w:p>
+        </w:tc>
+        <w:tc>
+          <w:tcPr/>
+          <w:p>
+            <w:pPr>
+              <w:pStyle w:val="Compact"/>
+            </w:pPr>
+            <w:r>
+              <w:t xml:space="preserve">2026-10-21</w:t>
             </w:r>
           </w:p>
         </w:tc>
@@ -880,18 +880,18 @@
               <w:pStyle w:val="Compact"/>
             </w:pPr>
             <w:r>
-              <w:t xml:space="preserve">54</w:t>
-            </w:r>
-          </w:p>
-        </w:tc>
-        <w:tc>
-          <w:tcPr/>
-          <w:p>
-            <w:pPr>
-              <w:pStyle w:val="Compact"/>
-            </w:pPr>
-            <w:r>
-              <w:t xml:space="preserve">2026-10-19</w:t>
+              <w:t xml:space="preserve">61</w:t>
+            </w:r>
+          </w:p>
+        </w:tc>
+        <w:tc>
+          <w:tcPr/>
+          <w:p>
+            <w:pPr>
+              <w:pStyle w:val="Compact"/>
+            </w:pPr>
+            <w:r>
+              <w:t xml:space="preserve">2026-10-21</w:t>
             </w:r>
           </w:p>
         </w:tc>
@@ -942,18 +942,18 @@
               <w:pStyle w:val="Compact"/>
             </w:pPr>
             <w:r>
-              <w:t xml:space="preserve">42</w:t>
-            </w:r>
-          </w:p>
-        </w:tc>
-        <w:tc>
-          <w:tcPr/>
-          <w:p>
-            <w:pPr>
-              <w:pStyle w:val="Compact"/>
-            </w:pPr>
-            <w:r>
-              <w:t xml:space="preserve">2026-10-19</w:t>
+              <w:t xml:space="preserve">50</w:t>
+            </w:r>
+          </w:p>
+        </w:tc>
+        <w:tc>
+          <w:tcPr/>
+          <w:p>
+            <w:pPr>
+              <w:pStyle w:val="Compact"/>
+            </w:pPr>
+            <w:r>
+              <w:t xml:space="preserve">2026-10-21</w:t>
             </w:r>
           </w:p>
         </w:tc>
@@ -1004,18 +1004,18 @@
               <w:pStyle w:val="Compact"/>
             </w:pPr>
             <w:r>
-              <w:t xml:space="preserve">46</w:t>
-            </w:r>
-          </w:p>
-        </w:tc>
-        <w:tc>
-          <w:tcPr/>
-          <w:p>
-            <w:pPr>
-              <w:pStyle w:val="Compact"/>
-            </w:pPr>
-            <w:r>
-              <w:t xml:space="preserve">2026-10-19</w:t>
+              <w:t xml:space="preserve">49</w:t>
+            </w:r>
+          </w:p>
+        </w:tc>
+        <w:tc>
+          <w:tcPr/>
+          <w:p>
+            <w:pPr>
+              <w:pStyle w:val="Compact"/>
+            </w:pPr>
+            <w:r>
+              <w:t xml:space="preserve">2026-10-21</w:t>
             </w:r>
           </w:p>
         </w:tc>
@@ -1066,18 +1066,18 @@
               <w:pStyle w:val="Compact"/>
             </w:pPr>
             <w:r>
-              <w:t xml:space="preserve">39</w:t>
-            </w:r>
-          </w:p>
-        </w:tc>
-        <w:tc>
-          <w:tcPr/>
-          <w:p>
-            <w:pPr>
-              <w:pStyle w:val="Compact"/>
-            </w:pPr>
-            <w:r>
-              <w:t xml:space="preserve">2026-10-19</w:t>
+              <w:t xml:space="preserve">42</w:t>
+            </w:r>
+          </w:p>
+        </w:tc>
+        <w:tc>
+          <w:tcPr/>
+          <w:p>
+            <w:pPr>
+              <w:pStyle w:val="Compact"/>
+            </w:pPr>
+            <w:r>
+              <w:t xml:space="preserve">2026-10-21</w:t>
             </w:r>
           </w:p>
         </w:tc>
@@ -1241,18 +1241,18 @@
               <w:pStyle w:val="Compact"/>
             </w:pPr>
             <w:r>
-              <w:t xml:space="preserve">442</w:t>
-            </w:r>
-          </w:p>
-        </w:tc>
-        <w:tc>
-          <w:tcPr/>
-          <w:p>
-            <w:pPr>
-              <w:pStyle w:val="Compact"/>
-            </w:pPr>
-            <w:r>
-              <w:t xml:space="preserve">47 100</w:t>
+              <w:t xml:space="preserve">449</w:t>
+            </w:r>
+          </w:p>
+        </w:tc>
+        <w:tc>
+          <w:tcPr/>
+          <w:p>
+            <w:pPr>
+              <w:pStyle w:val="Compact"/>
+            </w:pPr>
+            <w:r>
+              <w:t xml:space="preserve">48 202</w:t>
             </w:r>
           </w:p>
         </w:tc>
@@ -1296,18 +1296,18 @@
               <w:pStyle w:val="Compact"/>
             </w:pPr>
             <w:r>
-              <w:t xml:space="preserve">293</w:t>
-            </w:r>
-          </w:p>
-        </w:tc>
-        <w:tc>
-          <w:tcPr/>
-          <w:p>
-            <w:pPr>
-              <w:pStyle w:val="Compact"/>
-            </w:pPr>
-            <w:r>
-              <w:t xml:space="preserve">34 884</w:t>
+              <w:t xml:space="preserve">296</w:t>
+            </w:r>
+          </w:p>
+        </w:tc>
+        <w:tc>
+          <w:tcPr/>
+          <w:p>
+            <w:pPr>
+              <w:pStyle w:val="Compact"/>
+            </w:pPr>
+            <w:r>
+              <w:t xml:space="preserve">35 540</w:t>
             </w:r>
           </w:p>
         </w:tc>
@@ -1339,7 +1339,7 @@
         <w:t xml:space="preserve"> </w:t>
       </w:r>
       <w:r>
-        <w:t xml:space="preserve">Conteo del 20 de octubre de 2026 con</w:t>
+        <w:t xml:space="preserve">Conteo del 21 de octubre de 2026 con</w:t>
       </w:r>
       <w:r>
         <w:t xml:space="preserve"> </w:t>
@@ -1865,6 +1865,24 @@
               </w:rPr>
               <w:t xml:space="preserve">api</w:t>
             </w:r>
+            <w:r>
+              <w:t xml:space="preserve">;</w:t>
+            </w:r>
+            <w:r>
+              <w:t xml:space="preserve"> </w:t>
+            </w:r>
+            <w:r>
+              <w:rPr>
+                <w:rStyle w:val="VerbatimChar"/>
+              </w:rPr>
+              <w:t xml:space="preserve">auth</w:t>
+            </w:r>
+            <w:r>
+              <w:t xml:space="preserve"> </w:t>
+            </w:r>
+            <w:r>
+              <w:t xml:space="preserve">además sigue el inicio y el cierre de sesión de las otras pestañas del mismo navegador</w:t>
+            </w:r>
           </w:p>
         </w:tc>
       </w:tr>
@@ -1902,7 +1920,19 @@
               <w:pStyle w:val="Compact"/>
             </w:pPr>
             <w:r>
-              <w:t xml:space="preserve">Interfaces de los DTO y utilidades (por ejemplo traducción de errores de la API)</w:t>
+              <w:t xml:space="preserve">Interfaces de los DTO y utilidades (por ejemplo traducción de errores de la API y</w:t>
+            </w:r>
+            <w:r>
+              <w:t xml:space="preserve"> </w:t>
+            </w:r>
+            <w:r>
+              <w:rPr>
+                <w:rStyle w:val="VerbatimChar"/>
+              </w:rPr>
+              <w:t xml:space="preserve">image-compress.ts</w:t>
+            </w:r>
+            <w:r>
+              <w:t xml:space="preserve">, que reduce la imagen del comprobante a máximo 2 MB antes de subirla)</w:t>
             </w:r>
           </w:p>
         </w:tc>
@@ -3176,10 +3206,22 @@
               <w:t xml:space="preserve">AppProviders</w:t>
             </w:r>
             <w:r>
-              <w:t xml:space="preserve"> </w:t>
-            </w:r>
-            <w:r>
-              <w:t xml:space="preserve">y sincronización de preferencias de la cuenta</w:t>
+              <w:t xml:space="preserve">, sincronización de las preferencias de la cuenta y del token de avisos push, y</w:t>
+            </w:r>
+            <w:r>
+              <w:t xml:space="preserve"> </w:t>
+            </w:r>
+            <w:r>
+              <w:rPr>
+                <w:rStyle w:val="VerbatimChar"/>
+              </w:rPr>
+              <w:t xml:space="preserve">AppUpdatesCheck</w:t>
+            </w:r>
+            <w:r>
+              <w:t xml:space="preserve"> </w:t>
+            </w:r>
+            <w:r>
+              <w:t xml:space="preserve">(si el servidor publicó un APK más nuevo, exige instalarlo antes de seguir)</w:t>
             </w:r>
           </w:p>
         </w:tc>
@@ -3414,6 +3456,33 @@
               <w:t xml:space="preserve">payments</w:t>
             </w:r>
             <w:r>
+              <w:t xml:space="preserve"> </w:t>
+            </w:r>
+            <w:r>
+              <w:t xml:space="preserve">(con</w:t>
+            </w:r>
+            <w:r>
+              <w:t xml:space="preserve"> </w:t>
+            </w:r>
+            <w:r>
+              <w:rPr>
+                <w:rStyle w:val="VerbatimChar"/>
+              </w:rPr>
+              <w:t xml:space="preserve">receiptImage.ts</w:t>
+            </w:r>
+            <w:r>
+              <w:t xml:space="preserve">, que comprime el comprobante a máximo 2 MB),</w:t>
+            </w:r>
+            <w:r>
+              <w:t xml:space="preserve"> </w:t>
+            </w:r>
+            <w:r>
+              <w:rPr>
+                <w:rStyle w:val="VerbatimChar"/>
+              </w:rPr>
+              <w:t xml:space="preserve">notifications</w:t>
+            </w:r>
+            <w:r>
               <w:t xml:space="preserve">,</w:t>
             </w:r>
             <w:r>
@@ -3423,7 +3492,7 @@
               <w:rPr>
                 <w:rStyle w:val="VerbatimChar"/>
               </w:rPr>
-              <w:t xml:space="preserve">notifications</w:t>
+              <w:t xml:space="preserve">users</w:t>
             </w:r>
             <w:r>
               <w:t xml:space="preserve">,</w:t>
@@ -3435,7 +3504,25 @@
               <w:rPr>
                 <w:rStyle w:val="VerbatimChar"/>
               </w:rPr>
-              <w:t xml:space="preserve">users</w:t>
+              <w:t xml:space="preserve">appUpdates</w:t>
+            </w:r>
+            <w:r>
+              <w:t xml:space="preserve"> </w:t>
+            </w:r>
+            <w:r>
+              <w:t xml:space="preserve">(lee</w:t>
+            </w:r>
+            <w:r>
+              <w:t xml:space="preserve"> </w:t>
+            </w:r>
+            <w:r>
+              <w:rPr>
+                <w:rStyle w:val="VerbatimChar"/>
+              </w:rPr>
+              <w:t xml:space="preserve">/app/version.json</w:t>
+            </w:r>
+            <w:r>
+              <w:t xml:space="preserve">)</w:t>
             </w:r>
           </w:p>
         </w:tc>
@@ -5116,7 +5203,184 @@
     </w:tbl>
     <w:p>
       <w:pPr>
-        <w:pStyle w:val="BodyText"/>
+        <w:pStyle w:val="BlockText"/>
+      </w:pPr>
+      <w:r>
+        <w:rPr>
+          <w:i/>
+          <w:iCs/>
+        </w:rPr>
+        <w:t xml:space="preserve">Nota.</w:t>
+      </w:r>
+      <w:r>
+        <w:t xml:space="preserve"> </w:t>
+      </w:r>
+      <w:r>
+        <w:t xml:space="preserve">Las variables del 21 de octubre de 2026 no están en</w:t>
+      </w:r>
+      <w:r>
+        <w:t xml:space="preserve"> </w:t>
+      </w:r>
+      <w:r>
+        <w:rPr>
+          <w:rStyle w:val="VerbatimChar"/>
+        </w:rPr>
+        <w:t xml:space="preserve">.env.example</w:t>
+      </w:r>
+      <w:r>
+        <w:t xml:space="preserve"> </w:t>
+      </w:r>
+      <w:r>
+        <w:t xml:space="preserve">ni en el compose porque tienen valor por defecto:</w:t>
+      </w:r>
+      <w:r>
+        <w:t xml:space="preserve"> </w:t>
+      </w:r>
+      <w:r>
+        <w:rPr>
+          <w:rStyle w:val="VerbatimChar"/>
+        </w:rPr>
+        <w:t xml:space="preserve">SESSION_CHECK_ENABLED</w:t>
+      </w:r>
+      <w:r>
+        <w:t xml:space="preserve">,</w:t>
+      </w:r>
+      <w:r>
+        <w:t xml:space="preserve"> </w:t>
+      </w:r>
+      <w:r>
+        <w:rPr>
+          <w:rStyle w:val="VerbatimChar"/>
+        </w:rPr>
+        <w:t xml:space="preserve">SESSION_CHECK_CACHE_TTL</w:t>
+      </w:r>
+      <w:r>
+        <w:t xml:space="preserve"> </w:t>
+      </w:r>
+      <w:r>
+        <w:t xml:space="preserve">y</w:t>
+      </w:r>
+      <w:r>
+        <w:t xml:space="preserve"> </w:t>
+      </w:r>
+      <w:r>
+        <w:rPr>
+          <w:rStyle w:val="VerbatimChar"/>
+        </w:rPr>
+        <w:t xml:space="preserve">SESSION_CHECK_TIMEOUT</w:t>
+      </w:r>
+      <w:r>
+        <w:t xml:space="preserve"> </w:t>
+      </w:r>
+      <w:r>
+        <w:t xml:space="preserve">(chequeo de sesión del gateway: activo, 30 s y 3 s);</w:t>
+      </w:r>
+      <w:r>
+        <w:t xml:space="preserve"> </w:t>
+      </w:r>
+      <w:r>
+        <w:rPr>
+          <w:rStyle w:val="VerbatimChar"/>
+        </w:rPr>
+        <w:t xml:space="preserve">BOOKING_EXPIRY_CHECK_ENABLED</w:t>
+      </w:r>
+      <w:r>
+        <w:t xml:space="preserve"> </w:t>
+      </w:r>
+      <w:r>
+        <w:t xml:space="preserve">y</w:t>
+      </w:r>
+      <w:r>
+        <w:t xml:space="preserve"> </w:t>
+      </w:r>
+      <w:r>
+        <w:rPr>
+          <w:rStyle w:val="VerbatimChar"/>
+        </w:rPr>
+        <w:t xml:space="preserve">BOOKING_EXPIRY_CHECK_INTERVAL</w:t>
+      </w:r>
+      <w:r>
+        <w:t xml:space="preserve"> </w:t>
+      </w:r>
+      <w:r>
+        <w:t xml:space="preserve">(cancelación de las reservas programadas que vencieron sin confirmarse, en booking-service: activa y cada 5 minutos);</w:t>
+      </w:r>
+      <w:r>
+        <w:t xml:space="preserve"> </w:t>
+      </w:r>
+      <w:r>
+        <w:rPr>
+          <w:rStyle w:val="VerbatimChar"/>
+        </w:rPr>
+        <w:t xml:space="preserve">BOOKING_EXPIRY_GRACE_MINUTES</w:t>
+      </w:r>
+      <w:r>
+        <w:t xml:space="preserve"> </w:t>
+      </w:r>
+      <w:r>
+        <w:t xml:space="preserve">(60 minutos de margen después del fin de la reserva, que usan booking-service y operations-service), y</w:t>
+      </w:r>
+      <w:r>
+        <w:t xml:space="preserve"> </w:t>
+      </w:r>
+      <w:r>
+        <w:rPr>
+          <w:rStyle w:val="VerbatimChar"/>
+        </w:rPr>
+        <w:t xml:space="preserve">FOLLOW_UP_ENABLED</w:t>
+      </w:r>
+      <w:r>
+        <w:t xml:space="preserve"> </w:t>
+      </w:r>
+      <w:r>
+        <w:t xml:space="preserve">y</w:t>
+      </w:r>
+      <w:r>
+        <w:t xml:space="preserve"> </w:t>
+      </w:r>
+      <w:r>
+        <w:rPr>
+          <w:rStyle w:val="VerbatimChar"/>
+        </w:rPr>
+        <w:t xml:space="preserve">FOLLOW_UP_INTERVAL</w:t>
+      </w:r>
+      <w:r>
+        <w:t xml:space="preserve"> </w:t>
+      </w:r>
+      <w:r>
+        <w:t xml:space="preserve">(seguimiento de las reservas que terminaron y nadie cerró, en operations-service: activo y cada 5 minutos; necesita</w:t>
+      </w:r>
+      <w:r>
+        <w:t xml:space="preserve"> </w:t>
+      </w:r>
+      <w:r>
+        <w:rPr>
+          <w:rStyle w:val="VerbatimChar"/>
+        </w:rPr>
+        <w:t xml:space="preserve">INTERNAL_API_KEY</w:t>
+      </w:r>
+      <w:r>
+        <w:t xml:space="preserve">). Solo cambian si el servicio se corre desde el IDE o si se agregan al</w:t>
+      </w:r>
+      <w:r>
+        <w:t xml:space="preserve"> </w:t>
+      </w:r>
+      <w:r>
+        <w:rPr>
+          <w:rStyle w:val="VerbatimChar"/>
+        </w:rPr>
+        <w:t xml:space="preserve">environment</w:t>
+      </w:r>
+      <w:r>
+        <w:t xml:space="preserve"> </w:t>
+      </w:r>
+      <w:r>
+        <w:t xml:space="preserve">del servicio en el compose.</w:t>
+      </w:r>
+    </w:p>
+    <w:p>
+      <w:pPr>
+        <w:pStyle w:val="FirstParagraph"/>
       </w:pPr>
       <w:r>
         <w:t xml:space="preserve">Para correr un servicio Java desde la consola se usa su Maven Wrapper (</w:t>

</xml_diff>